<commit_message>
Decouple from the other project: remove all cross-references (POC1/Hidden Skills Radar/'companion') from README, methodology, briefing note, code comments and generated docx/pdf so this stands as an independent piece of work
</commit_message>
<xml_diff>
--- a/briefing/methodology.docx
+++ b/briefing/methodology.docx
@@ -44,7 +44,7 @@
           <w:sz w:val="26"/>
           <w:szCs w:val="26"/>
         </w:rPr>
-        <w:t xml:space="preserve">A companion proof-of-concept to the Hidden Skills Radar (POC 1), applying the same recognition-gap method to a different policy domain</w:t>
+        <w:t xml:space="preserve">A pre-registered proof-of-concept testing whether public search interest and academic publishing activity amplify the case that women’s brain health is economically material</w:t>
       </w:r>
     </w:p>
     <w:p>
@@ -148,7 +148,7 @@
           <w:sz w:val="22"/>
           <w:szCs w:val="22"/>
         </w:rPr>
-        <w:t xml:space="preserve">This is the canonical methodology document for this proposal. It mirrors POC1's three-layer architecture and pipeline structure, so both projects demonstrate the same underlying method (anticipatory policy intelligence from open digital signals) applied to two independent policy domains.</w:t>
+        <w:t xml:space="preserve">This is the canonical methodology document for this proposal. It sets out a three-layer architecture and pipeline structure for anticipatory policy intelligence from open digital signals, applied here to women’s brain health.</w:t>
       </w:r>
     </w:p>
     <w:p>
@@ -200,7 +200,7 @@
           <w:sz w:val="22"/>
           <w:szCs w:val="22"/>
         </w:rPr>
-        <w:t xml:space="preserve">Why this candidate. Three criteria drove selection over other possible topics: an existing institutional anchor to test against (OECD NAEC's Brain Capital programme already treats brain health as economically material, so this is not a case of manufacturing policy relevance from nothing); a plausible recognition lag (the candidate conditions, perimenopausal cognitive symptoms, adult-diagnosed ADHD, long-COVID cognitive effects, postpartum cognitive change, are the kind of combination-of-partially-recognised-elements case where POC1 also found its clearest signal, not isolated novel terms); and free, no-registration data access for a first pass (Google Trends and OpenAlex), so the decision to proceed past Stage 3 could be made on a week's effort rather than a procurement cycle. A topic failing any of the three would not have cleared this bar: no institutional anchor makes the “why does this matter” case harder to write; no plausible lag makes a null result uninformative; paid or gated data makes the first pass itself a commitment rather than a cheap test.</w:t>
+        <w:t xml:space="preserve">Why this candidate. Three criteria drove selection over other possible topics: an existing institutional anchor to test against (OECD NAEC's Brain Capital programme already treats brain health as economically material, so this is not a case of manufacturing policy relevance from nothing); a plausible recognition lag (the candidate conditions, perimenopausal cognitive symptoms, adult-diagnosed ADHD, long-COVID cognitive effects, postpartum cognitive change, are combinations of already-partially-recognised elements rather than isolated novel terms, which is where a recognition gap is most plausible); and free, no-registration data access for a first pass (Google Trends and OpenAlex), so the decision to proceed past Stage 3 could be made on a week's effort rather than a procurement cycle. A topic failing any of the three would not have cleared this bar: no institutional anchor makes the “why does this matter” case harder to write; no plausible lag makes a null result uninformative; paid or gated data makes the first pass itself a commitment rather than a cheap test.</w:t>
       </w:r>
     </w:p>
     <w:p>
@@ -286,7 +286,7 @@
           <w:sz w:val="22"/>
           <w:szCs w:val="22"/>
         </w:rPr>
-        <w:t xml:space="preserve">That framing question motivates the analysis but is not, on its own, what this pipeline measures. What the pipeline directly tests is the narrower and immediately computable version of it: for each of eight candidate topics spanning the female lifespan, is there a coverage gap between emerging public/research signal and formal biomedical recognition (MeSH), the same structure POC1 applied to ESCO and AI skills? Whether discourse is becoming more integrated across these topics, the sharper lifespan-silo question above, is related but distinct, and this pipeline does not yet measure it directly. It is flagged as the natural next stage in Section 7, once the per-topic layer is validated.</w:t>
+        <w:t xml:space="preserve">That framing question motivates the analysis but is not, on its own, what this pipeline measures. What the pipeline directly tests is the narrower and immediately computable version of it: for each of eight candidate topics spanning the female lifespan, is there a coverage gap between emerging public/research signal and formal biomedical recognition (MeSH)? Whether discourse is becoming more integrated across these topics, the sharper lifespan-silo question above, is related but distinct, and this pipeline does not yet measure it directly. It is flagged as the natural next stage in Section 7, once the per-topic layer is validated.</w:t>
       </w:r>
     </w:p>
     <w:p>
@@ -298,7 +298,7 @@
           <w:sz w:val="22"/>
           <w:szCs w:val="22"/>
         </w:rPr>
-        <w:t xml:space="preserve">The economic framing here (“brain capital,” labour-force participation) is the “why it matters” case that connects this analysis to existing OECD priorities, mirroring how POC1 connected AI skills detection to labour-market policy. It sits alongside, not in place of, the intrinsic case for closing gender gaps in brain-health recognition; the economic argument is a complement to that case, not a replacement for it.</w:t>
+        <w:t xml:space="preserve">The economic framing here (“brain capital,” labour-force participation) is the “why it matters” case that connects this analysis to existing OECD priorities. It sits alongside, not in place of, the intrinsic case for closing gender gaps in brain-health recognition; the economic argument is a complement to that case, not a replacement for it.</w:t>
       </w:r>
     </w:p>
     <w:p>
@@ -310,7 +310,7 @@
           <w:sz w:val="22"/>
           <w:szCs w:val="22"/>
         </w:rPr>
-        <w:t xml:space="preserve">Conditions such as perimenopausal cognitive symptoms, adult-diagnosed ADHD, long-COVID cognitive effects and postpartum cognitive change plausibly affect female labour-force participation and productivity, yet are inconsistently represented in formal biomedical classification systems, creating a recognition question directly analogous to the skills-recognition question in POC1.</w:t>
+        <w:t xml:space="preserve">Conditions such as perimenopausal cognitive symptoms, adult-diagnosed ADHD, long-COVID cognitive effects and postpartum cognitive change plausibly affect female labour-force participation and productivity, yet are inconsistently represented in formal biomedical classification systems, creating a recognition question that a repeatable measurement framework can test directly.</w:t>
       </w:r>
     </w:p>
     <w:p>
@@ -576,7 +576,7 @@
                 <w:sz w:val="20"/>
                 <w:szCs w:val="20"/>
               </w:rPr>
-              <w:t xml:space="preserve">No API key required; free; widely cited in public-health surveillance research. Reddit was considered (richer lived-experience language) but requires a registered API app; Google Trends can be collected immediately and captures rising public attention, the same function YouTube played in POC1.</w:t>
+              <w:t xml:space="preserve">No API key required; free; widely cited in public-health surveillance research. Reddit was considered (richer lived-experience language) but requires a registered API app; Google Trends can be collected immediately and captures rising public attention.</w:t>
             </w:r>
           </w:p>
         </w:tc>
@@ -694,7 +694,7 @@
                 <w:sz w:val="20"/>
                 <w:szCs w:val="20"/>
               </w:rPr>
-              <w:t xml:space="preserve">Free, no key required, comprehensive open scholarly index; plays the same role GitHub played in POC1, a production/output signal, not just discussion.</w:t>
+              <w:t xml:space="preserve">Free, no key required, comprehensive open scholarly index; a production/output signal, not just discussion.</w:t>
             </w:r>
           </w:p>
         </w:tc>
@@ -812,7 +812,7 @@
                 <w:sz w:val="20"/>
                 <w:szCs w:val="20"/>
               </w:rPr>
-              <w:t xml:space="preserve">Free, no-authentication REST API returning structured descriptor records, the closest available analog to how ESCO was used in POC1. WHO/ICD-11 was considered but its API requires registering a client id/secret before any data can be pulled; MeSH lets the pipeline run today. WHO/ICD-11 is kept as a named next-development-stage comparison layer (Section 7).</w:t>
+              <w:t xml:space="preserve">Free, no-authentication REST API returning structured descriptor records — a queryable, publicly governed concept taxonomy, not a dictionary look-up. WHO/ICD-11 was considered but its API requires registering a client id/secret before any data can be pulled; MeSH lets the pipeline run today. WHO/ICD-11 is kept as a named next-development-stage comparison layer (Section 7).</w:t>
             </w:r>
           </w:p>
         </w:tc>
@@ -829,7 +829,7 @@
           <w:sz w:val="22"/>
           <w:szCs w:val="22"/>
         </w:rPr>
-        <w:t xml:space="preserve">The three layers feed a single indicator, the Brain Health Priority Gap Index, the direct analog of POC1's Capability Recognition Gap Index.</w:t>
+        <w:t xml:space="preserve">The three layers feed a single indicator, the Brain Health Priority Gap Index.</w:t>
       </w:r>
     </w:p>
     <w:p>
@@ -855,7 +855,7 @@
           <w:sz w:val="22"/>
           <w:szCs w:val="22"/>
         </w:rPr>
-        <w:t xml:space="preserve">Following the same logic as POC1's “capability configurations” concept, several candidates are not single symptoms but combinations of already-partially-recognised elements (e.g. “ADHD in women” combines a recognised diagnostic category with an under-studied population; “long COVID cognitive effects” combines a novel condition with an established cognitive-science vocabulary). Eight candidate topics were selected to span distinct life stages, the same life stages the newsletter trigger for this proposal described as commonly discussed in isolation from one another, where lived-experience language plausibly precedes formal clinical terminology (full list and keyword patterns in data/taxonomy/candidate_topics.csv):</w:t>
+        <w:t xml:space="preserve">Several candidates are not single symptoms but combinations of already-partially-recognised elements (e.g. “ADHD in women” combines a recognised diagnostic category with an under-studied population; “long COVID cognitive effects” combines a novel condition with an established cognitive-science vocabulary). Eight candidate topics were selected to span distinct life stages, the same life stages the newsletter trigger for this proposal described as commonly discussed in isolation from one another, where lived-experience language plausibly precedes formal clinical terminology (full list and keyword patterns in data/taxonomy/candidate_topics.csv):</w:t>
       </w:r>
     </w:p>
     <w:p>
@@ -1017,7 +1017,7 @@
           <w:sz w:val="22"/>
           <w:szCs w:val="22"/>
         </w:rPr>
-        <w:t xml:space="preserve">The pipeline mirrors POC1's five conceptual stages and verified script order. Scripts and their inputs/outputs are described below as they will work once run; at pre-registration time, none had been executed yet.</w:t>
+        <w:t xml:space="preserve">The pipeline runs in five conceptual stages, each with a verified script order. Scripts and their inputs/outputs are described below as they will work once run; at pre-registration time, none had been executed yet.</w:t>
       </w:r>
     </w:p>
     <w:p>
@@ -1729,7 +1729,7 @@
                 <w:sz w:val="20"/>
                 <w:szCs w:val="20"/>
               </w:rPr>
-              <w:t xml:space="preserve">Mirrors build_text_corpus.py in POC1; feeds diagnostic term extraction</w:t>
+              <w:t xml:space="preserve">Feeds diagnostic term extraction</w:t>
             </w:r>
           </w:p>
         </w:tc>
@@ -1907,7 +1907,7 @@
                 <w:sz w:val="20"/>
                 <w:szCs w:val="20"/>
               </w:rPr>
-              <w:t xml:space="preserve">Direct analog of POC1's build_signal_dataset.py</w:t>
+              <w:t xml:space="preserve">Single source of truth for the emergence-scoring stage</w:t>
             </w:r>
           </w:p>
         </w:tc>
@@ -2654,7 +2654,7 @@
                 <w:sz w:val="20"/>
                 <w:szCs w:val="20"/>
               </w:rPr>
-              <w:t xml:space="preserve">Matches each candidate to the closest MeSH descriptor by text similarity. The zero-similarity tie-break fix from POC1 is built in from the start (a zero score is reported as no match, not an arbitrary nearest label)</w:t>
+              <w:t xml:space="preserve">Matches each candidate to the closest MeSH descriptor by text similarity. A zero-similarity result is reported as no match, not an arbitrary nearest label, fixed before this stage is run</w:t>
             </w:r>
           </w:p>
         </w:tc>
@@ -2683,7 +2683,7 @@
                 <w:sz w:val="20"/>
                 <w:szCs w:val="20"/>
               </w:rPr>
-              <w:t xml:space="preserve">Direct analog of esco_alignment.py, the step that produced a real, hard-to-spot bug in POC1, so it is being written correctly the first time here</w:t>
+              <w:t xml:space="preserve">Prevents a known text-similarity failure mode from ever entering the results</w:t>
             </w:r>
           </w:p>
         </w:tc>
@@ -3783,7 +3783,7 @@
                 <w:sz w:val="20"/>
                 <w:szCs w:val="20"/>
               </w:rPr>
-              <w:t xml:space="preserve">Analog of POC1's figure generator</w:t>
+              <w:t xml:space="preserve">Chart generation for the final report</w:t>
             </w:r>
           </w:p>
         </w:tc>
@@ -3872,7 +3872,7 @@
                 <w:sz w:val="20"/>
                 <w:szCs w:val="20"/>
               </w:rPr>
-              <w:t xml:space="preserve">Same toolchain as POC1</w:t>
+              <w:t xml:space="preserve">Final-output rendering</w:t>
             </w:r>
           </w:p>
         </w:tc>
@@ -4082,7 +4082,7 @@
                 <w:sz w:val="20"/>
                 <w:szCs w:val="20"/>
               </w:rPr>
-              <w:t xml:space="preserve">Exactly how POC1 kept O*NET/OpenAlex as an optional, clearly-labelled future-work comparison rather than presenting it as validated core methodology</w:t>
+              <w:t xml:space="preserve">Clearly-labelled future-work comparison, not presented as validated core methodology</w:t>
             </w:r>
           </w:p>
         </w:tc>
@@ -4591,7 +4591,7 @@
           <w:sz w:val="22"/>
           <w:szCs w:val="22"/>
         </w:rPr>
-        <w:t xml:space="preserve">Construct validity: search growth and publication growth may reflect attention rather than genuine emerging need, exactly as in POC1.</w:t>
+        <w:t xml:space="preserve">Construct validity: search growth and publication growth may reflect attention rather than genuine emerging need.</w:t>
       </w:r>
     </w:p>
     <w:p>
@@ -4642,7 +4642,7 @@
           <w:sz w:val="22"/>
           <w:szCs w:val="22"/>
         </w:rPr>
-        <w:t xml:space="preserve">MeSH coverage, reframed as an expected result rather than a threat to the finding: MeSH is a broad, mature vocabulary, so most individual candidate topics likely already have a reasonably close descriptor, unlike POC1's finding of near-total ESCO non-alignment for AI capabilities. That is the anticipated outcome here, not a null result: the interesting gap in this domain is not expected at the level of individual, already-medicalised symptoms, but at the level of lifespan integration, whether any single institutional or public framing connects these topics as one continuous trajectory, the way NAEC's own Brain Capital initiative already argues for (Section 1). This pipeline, as scoped, measures the former (per-topic recognition); it does not yet measure the latter (cross-topic integration), see Section 7.</w:t>
+        <w:t xml:space="preserve">MeSH coverage, reframed as an expected result rather than a threat to the finding: MeSH is a broad, mature vocabulary, so most individual candidate topics likely already have a reasonably close descriptor. That is the anticipated outcome here, not a null result: the interesting gap in this domain is not expected at the level of individual, already-medicalised symptoms, but at the level of lifespan integration, whether any single institutional or public framing connects these topics as one continuous trajectory, the way NAEC's own Brain Capital initiative already argues for (Section 1). This pipeline, as scoped, measures the former (per-topic recognition); it does not yet measure the latter (cross-topic integration), see Section 7.</w:t>
       </w:r>
     </w:p>
     <w:p>
@@ -4791,7 +4791,7 @@
           <w:sz w:val="22"/>
           <w:szCs w:val="22"/>
         </w:rPr>
-        <w:t xml:space="preserve">Output at that stage: not a full formatted briefing note. A short proposal (see the companion evidence document) reporting the emergence score per topic, without yet claiming a recognition gap; the MeSH layer (Stage 4) would follow only if the emergence results justify the additional step.</w:t>
+        <w:t xml:space="preserve">Output at that stage: not a full formatted briefing note. A short proposal (see the accompanying evidence document) reporting the emergence score per topic, without yet claiming a recognition gap; the MeSH layer (Stage 4) would follow only if the emergence results justify the additional step.</w:t>
       </w:r>
     </w:p>
     <w:p>
@@ -4803,7 +4803,7 @@
           <w:sz w:val="22"/>
           <w:szCs w:val="22"/>
         </w:rPr>
-        <w:t xml:space="preserve">Decision point after that: if the emergence layer surfaces a meaningful signal, proceed to MeSH matching and the full Priority Gap Index (Stages 4-5), and publish as a short briefing note comparable in scope to POC1. If not, the negative result is itself useful: it would suggest women's brain health topics are not currently under-tracked in public/research discourse relative to formal recognition, a defensible, reportable finding on its own rather than a failed pilot.</w:t>
+        <w:t xml:space="preserve">Decision point after that: if the emergence layer surfaces a meaningful signal, proceed to MeSH matching and the full Priority Gap Index (Stages 4-5), and publish as a short briefing note. If not, the negative result is itself useful: it would suggest women's brain health topics are not currently under-tracked in public/research discourse relative to formal recognition, a defensible, reportable finding on its own rather than a failed pilot.</w:t>
       </w:r>
     </w:p>
     <w:p>

</xml_diff>